<commit_message>
Numune sayısını ve ölçüm teyidini işle, özeti güncelle
Yazar teyit etti: formülasyon başına üç küp dökülmüş (n=3) ve kuruma
sonrası kesit ölçümü laboratuvarda yapılmış. Böylece basma verisinin hem
MPa değerleri hem de numune sayısı savunulabilir hale geldi.

Özet buna göre güncellendi: keşifsel nitelemesi kaldırıldı, yerine numune
sayısı ve ortalama basınç dayanımı aralığı (2,55-4,10 MPa) kondu. 248 kelime.

Kalan iki eksik not edildi: tek tek küp değerleri olmadığı için standart
sapma hesaplanamıyor, ve eğilme testinin numune sayısı henüz bilinmiyor.

Co-Authored-By: Claude Opus 5 <noreply@anthropic.com>
Claude-Session: https://claude.ai/code/session_01N92FbpMhSF7GJYZXiJxxP2
</commit_message>
<xml_diff>
--- a/konferans-bildirisi/04-metin/ICSMMEP26_Abstract_Unal.docx
+++ b/konferans-bildirisi/04-metin/ICSMMEP26_Abstract_Unal.docx
@@ -498,25 +498,25 @@
         <w:spacing w:before="0" w:beforeAutospacing="0" w:after="240" w:afterAutospacing="0"/>
       </w:pPr>
       <w:r>
-        <w:t xml:space="preserve">The principal contribution is a reproducible production protocol. Shells are heat-treated at 120 °C, milled, and sieved to 150 µm. Agar is dissolved in a water–glycerol phase at 95 °C, then held at 80 °C under continuous stirring for 55 minutes, with the mineral fraction added incrementally near the end. The mixture is cast in silicone moulds, dried four days at ambient temperature, and consolidated for seven days. This addresses a known barrier in designer-led biofabrication, where absent shared procedures prevent reproduction and comparison.</w:t>
-      </w:r>
-    </w:p>
-    <w:p>
-      <w:pPr>
-        <w:pStyle w:val="NormalWeb"/>
-        <w:spacing w:before="0" w:beforeAutospacing="0" w:after="240" w:afterAutospacing="0"/>
-      </w:pPr>
-      <w:r>
-        <w:t xml:space="preserve">Characterisation covers compression, three-point flexure, ignitability, and water absorption, and is an exploratory baseline, not design values. Raising the mineral and agar fractions while reducing water increased compressive load capacity from 3.89 to 6.80 kN. Halving the glycerol content shifted the material from unmeasurably ductile to a flexural strength of 2.33 MPa at a modulus of 192 MPa. Specimens self-extinguished four seconds after flame removal; shellac-coated specimens absorbed 0.7% of their mass over 24 hours of immersion.</w:t>
-      </w:r>
-    </w:p>
-    <w:p>
-      <w:pPr>
-        <w:pStyle w:val="NormalWeb"/>
-        <w:spacing w:before="0" w:beforeAutospacing="0" w:after="240" w:afterAutospacing="0"/>
-      </w:pPr>
-      <w:r>
-        <w:t xml:space="preserve">The low flexural modulus of such materials, conventionally reported as a deficiency, yields a modulus of resilience exceeding that of brittle mineral interior materials. The study therefore proposes resilience rather than strength as the governing evaluation criterion.</w:t>
+        <w:t xml:space="preserve">The principal contribution is a reproducible production protocol. Shells are heat-treated at 120 °C, milled, and sieved to 150 µm. Agar is dissolved in a water–glycerol phase at 95 °C, then held at 80 °C under continuous stirring for 55 minutes, with the mineral fraction added incrementally near the end. The mixture is cast in silicone moulds, dried four days at ambient temperature, and consolidated for seven days. This addresses a known barrier in designer-led biofabrication, where absent shared procedures prevent reproduction.</w:t>
+      </w:r>
+    </w:p>
+    <w:p>
+      <w:pPr>
+        <w:pStyle w:val="NormalWeb"/>
+        <w:spacing w:before="0" w:beforeAutospacing="0" w:after="240" w:afterAutospacing="0"/>
+      </w:pPr>
+      <w:r>
+        <w:t xml:space="preserve">Characterisation covers compression, three-point flexure, ignitability, and water absorption, with three specimens tested per compression formulation. Raising the mineral and agar fractions while reducing water increased mean compressive strength from 2.55 to 4.10 MPa. Halving the glycerol content shifted the material from unmeasurably ductile to a flexural strength of 2.33 MPa at a modulus of 192 MPa. Specimens self-extinguished four seconds after flame removal; shellac-coated specimens absorbed 0.7% of their mass over 24 hours of immersion.</w:t>
+      </w:r>
+    </w:p>
+    <w:p>
+      <w:pPr>
+        <w:pStyle w:val="NormalWeb"/>
+        <w:spacing w:before="0" w:beforeAutospacing="0" w:after="240" w:afterAutospacing="0"/>
+      </w:pPr>
+      <w:r>
+        <w:t xml:space="preserve">The low flexural modulus of such materials, conventionally reported as a deficiency, yields a modulus of resilience exceeding that of brittle mineral interior materials. The study therefore proposes resilience rather than strength as the governing evaluation criterion for bio-based interior surfaces.</w:t>
       </w:r>
     </w:p>
     <w:p>

</xml_diff>